<commit_message>
v2.20 (John's word, 3 October): the S7-8 combined run sheet brought in step with the deck and the S7 run sheet (check-in 7:08, the room reads itself 7:25, chain 7:34, PROAPT together 7:40, two passes 7:50, Tell 8:13, merge 8:19 to the container holder; narrative + homework note updated; two pages kept); the opening evenings set straight on the front page — S1-2 and S3-4 each walked as one evening in August, before S5 on September 15; changelog v2.20
Co-Authored-By: Claude Opus 5.5 <noreply@anthropic.com>
</commit_message>
<xml_diff>
--- a/_implementation-notes/evening-series/FotH Pilot Session 7-8 Combined Evening Run Sheet DRAFT v1.docx
+++ b/_implementation-notes/evening-series/FotH Pilot Session 7-8 Combined Evening Run Sheet DRAFT v1.docx
@@ -47,17 +47,18 @@
       <w:tblPr>
         <w:tblStyle w:val="TableGrid"/>
         <w:tblW w:type="auto" w:w="0"/>
+        <w:tblLayout w:type="fixed"/>
         <w:tblLook w:firstColumn="1" w:firstRow="1" w:lastColumn="0" w:lastRow="0" w:noHBand="0" w:noVBand="1" w:val="04A0"/>
       </w:tblPr>
       <w:tblGrid>
-        <w:gridCol w:w="3216"/>
-        <w:gridCol w:w="3216"/>
-        <w:gridCol w:w="3216"/>
+        <w:gridCol w:w="1368"/>
+        <w:gridCol w:w="5616"/>
+        <w:gridCol w:w="2664"/>
       </w:tblGrid>
       <w:tr>
         <w:tc>
           <w:tcPr>
-            <w:tcW w:type="dxa" w:w="3216"/>
+            <w:tcW w:type="dxa" w:w="1368"/>
           </w:tcPr>
           <w:p>
             <w:r>
@@ -71,7 +72,7 @@
         </w:tc>
         <w:tc>
           <w:tcPr>
-            <w:tcW w:type="dxa" w:w="3216"/>
+            <w:tcW w:type="dxa" w:w="5616"/>
           </w:tcPr>
           <w:p>
             <w:r>
@@ -85,7 +86,7 @@
         </w:tc>
         <w:tc>
           <w:tcPr>
-            <w:tcW w:type="dxa" w:w="3216"/>
+            <w:tcW w:type="dxa" w:w="2664"/>
           </w:tcPr>
           <w:p>
             <w:r>
@@ -101,7 +102,7 @@
       <w:tr>
         <w:tc>
           <w:tcPr>
-            <w:tcW w:type="dxa" w:w="3216"/>
+            <w:tcW w:type="dxa" w:w="1368"/>
           </w:tcPr>
           <w:p>
             <w:r>
@@ -114,7 +115,7 @@
         </w:tc>
         <w:tc>
           <w:tcPr>
-            <w:tcW w:type="dxa" w:w="3216"/>
+            <w:tcW w:type="dxa" w:w="5616"/>
           </w:tcPr>
           <w:p>
             <w:r>
@@ -127,7 +128,7 @@
         </w:tc>
         <w:tc>
           <w:tcPr>
-            <w:tcW w:type="dxa" w:w="3216"/>
+            <w:tcW w:type="dxa" w:w="2664"/>
           </w:tcPr>
           <w:p>
             <w:r>
@@ -142,33 +143,33 @@
       <w:tr>
         <w:tc>
           <w:tcPr>
-            <w:tcW w:type="dxa" w:w="3216"/>
+            <w:tcW w:type="dxa" w:w="1368"/>
           </w:tcPr>
           <w:p>
             <w:r>
               <w:rPr>
                 <w:sz w:val="19"/>
               </w:rPr>
-              <w:t>7:00–7:06</w:t>
+              <w:t>7:00–7:08</w:t>
             </w:r>
           </w:p>
         </w:tc>
         <w:tc>
           <w:tcPr>
-            <w:tcW w:type="dxa" w:w="3216"/>
+            <w:tcW w:type="dxa" w:w="5616"/>
           </w:tcPr>
           <w:p>
             <w:r>
               <w:rPr>
                 <w:sz w:val="19"/>
               </w:rPr>
-              <w:t>Opening container — blessing, the map, container reminder.</w:t>
+              <w:t>Opening container — blessing, the map, container reminder; frame the turn toward God.</w:t>
             </w:r>
           </w:p>
         </w:tc>
         <w:tc>
           <w:tcPr>
-            <w:tcW w:type="dxa" w:w="3216"/>
+            <w:tcW w:type="dxa" w:w="2664"/>
           </w:tcPr>
           <w:p>
             <w:r>
@@ -183,33 +184,33 @@
       <w:tr>
         <w:tc>
           <w:tcPr>
-            <w:tcW w:type="dxa" w:w="3216"/>
+            <w:tcW w:type="dxa" w:w="1368"/>
           </w:tcPr>
           <w:p>
             <w:r>
               <w:rPr>
                 <w:sz w:val="19"/>
               </w:rPr>
-              <w:t>7:06–7:12</w:t>
+              <w:t>7:08–7:25</w:t>
             </w:r>
           </w:p>
         </w:tc>
         <w:tc>
           <w:tcPr>
-            <w:tcW w:type="dxa" w:w="3216"/>
+            <w:tcW w:type="dxa" w:w="5616"/>
           </w:tcPr>
           <w:p>
             <w:r>
               <w:rPr>
                 <w:sz w:val="19"/>
               </w:rPr>
-              <w:t>Check-in — one sentence each on the homework practice since we last met; re-entry honesty: a thin week is an honest answer.</w:t>
+              <w:t>Check-in circle — two weeks of the Examen reported; week-one check-ins debriefed. One sentence each; a thin week is an honest answer. A parent starts the sharing.</w:t>
             </w:r>
           </w:p>
         </w:tc>
         <w:tc>
           <w:tcPr>
-            <w:tcW w:type="dxa" w:w="3216"/>
+            <w:tcW w:type="dxa" w:w="2664"/>
           </w:tcPr>
           <w:p>
             <w:r>
@@ -224,20 +225,61 @@
       <w:tr>
         <w:tc>
           <w:tcPr>
-            <w:tcW w:type="dxa" w:w="3216"/>
+            <w:tcW w:type="dxa" w:w="1368"/>
           </w:tcPr>
           <w:p>
             <w:r>
               <w:rPr>
                 <w:sz w:val="19"/>
               </w:rPr>
-              <w:t>7:12–7:20</w:t>
+              <w:t>7:25–7:34</w:t>
             </w:r>
           </w:p>
         </w:tc>
         <w:tc>
           <w:tcPr>
-            <w:tcW w:type="dxa" w:w="3216"/>
+            <w:tcW w:type="dxa" w:w="5616"/>
+          </w:tcPr>
+          <w:p>
+            <w:r>
+              <w:rPr>
+                <w:sz w:val="19"/>
+              </w:rPr>
+              <w:t>The room reads itself — the three questions from Session 6 answered aloud (keep · change · tell), about the group, never any one person. The leader answers first, a moment attached to each; the Co-Companion scribes.</w:t>
+            </w:r>
+          </w:p>
+        </w:tc>
+        <w:tc>
+          <w:tcPr>
+            <w:tcW w:type="dxa" w:w="2664"/>
+          </w:tcPr>
+          <w:p>
+            <w:r>
+              <w:rPr>
+                <w:sz w:val="19"/>
+              </w:rPr>
+              <w:t>Content presenter; container holder watching the room</w:t>
+            </w:r>
+          </w:p>
+        </w:tc>
+      </w:tr>
+      <w:tr>
+        <w:tc>
+          <w:tcPr>
+            <w:tcW w:type="dxa" w:w="1368"/>
+          </w:tcPr>
+          <w:p>
+            <w:r>
+              <w:rPr>
+                <w:sz w:val="19"/>
+              </w:rPr>
+              <w:t>7:34–7:40</w:t>
+            </w:r>
+          </w:p>
+        </w:tc>
+        <w:tc>
+          <w:tcPr>
+            <w:tcW w:type="dxa" w:w="5616"/>
           </w:tcPr>
           <w:p>
             <w:r>
@@ -250,7 +292,7 @@
         </w:tc>
         <w:tc>
           <w:tcPr>
-            <w:tcW w:type="dxa" w:w="3216"/>
+            <w:tcW w:type="dxa" w:w="2664"/>
           </w:tcPr>
           <w:p>
             <w:r>
@@ -265,33 +307,74 @@
       <w:tr>
         <w:tc>
           <w:tcPr>
-            <w:tcW w:type="dxa" w:w="3216"/>
+            <w:tcW w:type="dxa" w:w="1368"/>
           </w:tcPr>
           <w:p>
             <w:r>
               <w:rPr>
                 <w:sz w:val="19"/>
               </w:rPr>
-              <w:t>7:20–7:38</w:t>
+              <w:t>7:40–7:49</w:t>
             </w:r>
           </w:p>
         </w:tc>
         <w:tc>
           <w:tcPr>
-            <w:tcW w:type="dxa" w:w="3216"/>
+            <w:tcW w:type="dxa" w:w="5616"/>
           </w:tcPr>
           <w:p>
             <w:r>
               <w:rPr>
                 <w:sz w:val="19"/>
               </w:rPr>
-              <w:t>PROAPT walked together — Mark 1:14–20, the six steps, teen-led.</w:t>
+              <w:t>PROAPT walked together — Mark 1:14–20, the six steps, teen-led. Teach the order before the pens move: data before interpretation (slide 10 notes, WHY).</w:t>
             </w:r>
           </w:p>
         </w:tc>
         <w:tc>
           <w:tcPr>
-            <w:tcW w:type="dxa" w:w="3216"/>
+            <w:tcW w:type="dxa" w:w="2664"/>
+          </w:tcPr>
+          <w:p>
+            <w:r>
+              <w:rPr>
+                <w:sz w:val="19"/>
+              </w:rPr>
+              <w:t>Content presenter; container holder watching the room</w:t>
+            </w:r>
+          </w:p>
+        </w:tc>
+      </w:tr>
+      <w:tr>
+        <w:tc>
+          <w:tcPr>
+            <w:tcW w:type="dxa" w:w="1368"/>
+          </w:tcPr>
+          <w:p>
+            <w:r>
+              <w:rPr>
+                <w:sz w:val="19"/>
+              </w:rPr>
+              <w:t>7:49–7:50</w:t>
+            </w:r>
+          </w:p>
+        </w:tc>
+        <w:tc>
+          <w:tcPr>
+            <w:tcW w:type="dxa" w:w="5616"/>
+          </w:tcPr>
+          <w:p>
+            <w:r>
+              <w:rPr>
+                <w:sz w:val="19"/>
+              </w:rPr>
+              <w:t>Bridge — family pairs, one Reader one Listener; the Lead Companion settles pairs and odd numbers.</w:t>
+            </w:r>
+          </w:p>
+        </w:tc>
+        <w:tc>
+          <w:tcPr>
+            <w:tcW w:type="dxa" w:w="2664"/>
           </w:tcPr>
           <w:p>
             <w:r>
@@ -306,33 +389,74 @@
       <w:tr>
         <w:tc>
           <w:tcPr>
-            <w:tcW w:type="dxa" w:w="3216"/>
+            <w:tcW w:type="dxa" w:w="1368"/>
           </w:tcPr>
           <w:p>
             <w:r>
               <w:rPr>
                 <w:sz w:val="19"/>
               </w:rPr>
-              <w:t>7:38–7:42</w:t>
+              <w:t>7:50–8:13</w:t>
             </w:r>
           </w:p>
         </w:tc>
         <w:tc>
           <w:tcPr>
-            <w:tcW w:type="dxa" w:w="3216"/>
+            <w:tcW w:type="dxa" w:w="5616"/>
           </w:tcPr>
           <w:p>
             <w:r>
               <w:rPr>
                 <w:sz w:val="19"/>
               </w:rPr>
-              <w:t>Bridge — family pairs, one Reader one Listener; the Lead Companion settles pairs and odd numbers.</w:t>
+              <w:t>Two passes in pairs — about twelve minutes each: pass one deepens Mark 1; switch roles; pass two on Mark 2:1–12 (a passage speaks differently on a second hearing).</w:t>
             </w:r>
           </w:p>
         </w:tc>
         <w:tc>
           <w:tcPr>
-            <w:tcW w:type="dxa" w:w="3216"/>
+            <w:tcW w:type="dxa" w:w="2664"/>
+          </w:tcPr>
+          <w:p>
+            <w:r>
+              <w:rPr>
+                <w:sz w:val="19"/>
+              </w:rPr>
+              <w:t>Content presenter; container holder watching the room</w:t>
+            </w:r>
+          </w:p>
+        </w:tc>
+      </w:tr>
+      <w:tr>
+        <w:tc>
+          <w:tcPr>
+            <w:tcW w:type="dxa" w:w="1368"/>
+          </w:tcPr>
+          <w:p>
+            <w:r>
+              <w:rPr>
+                <w:sz w:val="19"/>
+              </w:rPr>
+              <w:t>8:13–8:19</w:t>
+            </w:r>
+          </w:p>
+        </w:tc>
+        <w:tc>
+          <w:tcPr>
+            <w:tcW w:type="dxa" w:w="5616"/>
+          </w:tcPr>
+          <w:p>
+            <w:r>
+              <w:rPr>
+                <w:sz w:val="19"/>
+              </w:rPr>
+              <w:t>Tell step — one specific sentence to your pair partner; a parent opens.</w:t>
+            </w:r>
+          </w:p>
+        </w:tc>
+        <w:tc>
+          <w:tcPr>
+            <w:tcW w:type="dxa" w:w="2664"/>
           </w:tcPr>
           <w:p>
             <w:r>
@@ -347,40 +471,40 @@
       <w:tr>
         <w:tc>
           <w:tcPr>
-            <w:tcW w:type="dxa" w:w="3216"/>
+            <w:tcW w:type="dxa" w:w="1368"/>
           </w:tcPr>
           <w:p>
             <w:r>
               <w:rPr>
                 <w:sz w:val="19"/>
               </w:rPr>
-              <w:t>7:42–8:06</w:t>
+              <w:t>8:19–8:20</w:t>
             </w:r>
           </w:p>
         </w:tc>
         <w:tc>
           <w:tcPr>
-            <w:tcW w:type="dxa" w:w="3216"/>
+            <w:tcW w:type="dxa" w:w="5616"/>
           </w:tcPr>
           <w:p>
             <w:r>
               <w:rPr>
                 <w:sz w:val="19"/>
               </w:rPr>
-              <w:t>Two passes in pairs — 12 minutes each: pass one deepens Mark 1; switch roles; pass two on Mark 2:1–12 (a passage speaks differently on a second hearing).</w:t>
+              <w:t>Merge — one word on what the practice was like (not what was heard); a parent begins.</w:t>
             </w:r>
           </w:p>
         </w:tc>
         <w:tc>
           <w:tcPr>
-            <w:tcW w:type="dxa" w:w="3216"/>
+            <w:tcW w:type="dxa" w:w="2664"/>
           </w:tcPr>
           <w:p>
             <w:r>
               <w:rPr>
                 <w:sz w:val="19"/>
               </w:rPr>
-              <w:t>Content presenter; container holder watching the room</w:t>
+              <w:t>Container holder leads the merge; content presenter supporting</w:t>
             </w:r>
           </w:p>
         </w:tc>
@@ -388,33 +512,33 @@
       <w:tr>
         <w:tc>
           <w:tcPr>
-            <w:tcW w:type="dxa" w:w="3216"/>
+            <w:tcW w:type="dxa" w:w="1368"/>
           </w:tcPr>
           <w:p>
             <w:r>
               <w:rPr>
                 <w:sz w:val="19"/>
               </w:rPr>
-              <w:t>8:06–8:12</w:t>
+              <w:t>8:20–8:24</w:t>
             </w:r>
           </w:p>
         </w:tc>
         <w:tc>
           <w:tcPr>
-            <w:tcW w:type="dxa" w:w="3216"/>
+            <w:tcW w:type="dxa" w:w="5616"/>
           </w:tcPr>
           <w:p>
             <w:r>
               <w:rPr>
                 <w:sz w:val="19"/>
               </w:rPr>
-              <w:t>Tell step — one sentence to your pair partner.</w:t>
+              <w:t>Homework commissioning — daily PROAPT, one passage a day; passage paths on the handout; time of day committed aloud; sheets (with the PROAPT companion page) + partners.</w:t>
             </w:r>
           </w:p>
         </w:tc>
         <w:tc>
           <w:tcPr>
-            <w:tcW w:type="dxa" w:w="3216"/>
+            <w:tcW w:type="dxa" w:w="2664"/>
           </w:tcPr>
           <w:p>
             <w:r>
@@ -429,33 +553,74 @@
       <w:tr>
         <w:tc>
           <w:tcPr>
-            <w:tcW w:type="dxa" w:w="3216"/>
+            <w:tcW w:type="dxa" w:w="1368"/>
           </w:tcPr>
           <w:p>
             <w:r>
               <w:rPr>
                 <w:sz w:val="19"/>
               </w:rPr>
-              <w:t>8:12–8:16</w:t>
+              <w:t>8:24–8:28</w:t>
             </w:r>
           </w:p>
         </w:tc>
         <w:tc>
           <w:tcPr>
-            <w:tcW w:type="dxa" w:w="3216"/>
+            <w:tcW w:type="dxa" w:w="5616"/>
           </w:tcPr>
           <w:p>
             <w:r>
               <w:rPr>
                 <w:sz w:val="19"/>
               </w:rPr>
-              <w:t>Merge — one word on what the practice was like (not what was heard); a parent begins.</w:t>
+              <w:t>Leader Feedback Round, both leaders: what went well, what I would do differently, the teach-back.</w:t>
             </w:r>
           </w:p>
         </w:tc>
         <w:tc>
           <w:tcPr>
-            <w:tcW w:type="dxa" w:w="3216"/>
+            <w:tcW w:type="dxa" w:w="2664"/>
+          </w:tcPr>
+          <w:p>
+            <w:r>
+              <w:rPr>
+                <w:sz w:val="19"/>
+              </w:rPr>
+              <w:t>Both leaders</w:t>
+            </w:r>
+          </w:p>
+        </w:tc>
+      </w:tr>
+      <w:tr>
+        <w:tc>
+          <w:tcPr>
+            <w:tcW w:type="dxa" w:w="1368"/>
+          </w:tcPr>
+          <w:p>
+            <w:r>
+              <w:rPr>
+                <w:sz w:val="19"/>
+              </w:rPr>
+              <w:t>8:28–8:30</w:t>
+            </w:r>
+          </w:p>
+        </w:tc>
+        <w:tc>
+          <w:tcPr>
+            <w:tcW w:type="dxa" w:w="5616"/>
+          </w:tcPr>
+          <w:p>
+            <w:r>
+              <w:rPr>
+                <w:sz w:val="19"/>
+              </w:rPr>
+              <w:t>Closing container reaffirmed; Aaronic blessing.</w:t>
+            </w:r>
+          </w:p>
+        </w:tc>
+        <w:tc>
+          <w:tcPr>
+            <w:tcW w:type="dxa" w:w="2664"/>
           </w:tcPr>
           <w:p>
             <w:r>
@@ -470,130 +635,7 @@
       <w:tr>
         <w:tc>
           <w:tcPr>
-            <w:tcW w:type="dxa" w:w="3216"/>
-          </w:tcPr>
-          <w:p>
-            <w:r>
-              <w:rPr>
-                <w:sz w:val="19"/>
-              </w:rPr>
-              <w:t>8:16–8:20</w:t>
-            </w:r>
-          </w:p>
-        </w:tc>
-        <w:tc>
-          <w:tcPr>
-            <w:tcW w:type="dxa" w:w="3216"/>
-          </w:tcPr>
-          <w:p>
-            <w:r>
-              <w:rPr>
-                <w:sz w:val="19"/>
-              </w:rPr>
-              <w:t>Homework commissioning — daily PROAPT, one passage a day; passage paths on the handout; time of day committed aloud; sheets + partners.</w:t>
-            </w:r>
-          </w:p>
-        </w:tc>
-        <w:tc>
-          <w:tcPr>
-            <w:tcW w:type="dxa" w:w="3216"/>
-          </w:tcPr>
-          <w:p>
-            <w:r>
-              <w:rPr>
-                <w:sz w:val="19"/>
-              </w:rPr>
-              <w:t>Content presenter</w:t>
-            </w:r>
-          </w:p>
-        </w:tc>
-      </w:tr>
-      <w:tr>
-        <w:tc>
-          <w:tcPr>
-            <w:tcW w:type="dxa" w:w="3216"/>
-          </w:tcPr>
-          <w:p>
-            <w:r>
-              <w:rPr>
-                <w:sz w:val="19"/>
-              </w:rPr>
-              <w:t>8:20–8:24</w:t>
-            </w:r>
-          </w:p>
-        </w:tc>
-        <w:tc>
-          <w:tcPr>
-            <w:tcW w:type="dxa" w:w="3216"/>
-          </w:tcPr>
-          <w:p>
-            <w:r>
-              <w:rPr>
-                <w:sz w:val="19"/>
-              </w:rPr>
-              <w:t>Leader Feedback Round.</w:t>
-            </w:r>
-          </w:p>
-        </w:tc>
-        <w:tc>
-          <w:tcPr>
-            <w:tcW w:type="dxa" w:w="3216"/>
-          </w:tcPr>
-          <w:p>
-            <w:r>
-              <w:rPr>
-                <w:sz w:val="19"/>
-              </w:rPr>
-              <w:t>Both leaders</w:t>
-            </w:r>
-          </w:p>
-        </w:tc>
-      </w:tr>
-      <w:tr>
-        <w:tc>
-          <w:tcPr>
-            <w:tcW w:type="dxa" w:w="3216"/>
-          </w:tcPr>
-          <w:p>
-            <w:r>
-              <w:rPr>
-                <w:sz w:val="19"/>
-              </w:rPr>
-              <w:t>8:24–8:30</w:t>
-            </w:r>
-          </w:p>
-        </w:tc>
-        <w:tc>
-          <w:tcPr>
-            <w:tcW w:type="dxa" w:w="3216"/>
-          </w:tcPr>
-          <w:p>
-            <w:r>
-              <w:rPr>
-                <w:sz w:val="19"/>
-              </w:rPr>
-              <w:t>Closing container; Aaronic blessing.</w:t>
-            </w:r>
-          </w:p>
-        </w:tc>
-        <w:tc>
-          <w:tcPr>
-            <w:tcW w:type="dxa" w:w="3216"/>
-          </w:tcPr>
-          <w:p>
-            <w:r>
-              <w:rPr>
-                <w:sz w:val="19"/>
-              </w:rPr>
-              <w:t>Container holder</w:t>
-            </w:r>
-          </w:p>
-        </w:tc>
-      </w:tr>
-      <w:tr>
-        <w:tc>
-          <w:tcPr>
-            <w:tcW w:type="dxa" w:w="3216"/>
+            <w:tcW w:type="dxa" w:w="1368"/>
           </w:tcPr>
           <w:p>
             <w:r>
@@ -606,20 +648,20 @@
         </w:tc>
         <w:tc>
           <w:tcPr>
-            <w:tcW w:type="dxa" w:w="3216"/>
+            <w:tcW w:type="dxa" w:w="5616"/>
           </w:tcPr>
           <w:p>
             <w:r>
               <w:rPr>
                 <w:sz w:val="19"/>
               </w:rPr>
-              <w:t>Fellowship; the room's feedback; the five-question materials debrief; planning.</w:t>
+              <w:t>Fellowship; the room's feedback to the leaders; the five-question materials debrief; planning the next meeting.</w:t>
             </w:r>
           </w:p>
         </w:tc>
         <w:tc>
           <w:tcPr>
-            <w:tcW w:type="dxa" w:w="3216"/>
+            <w:tcW w:type="dxa" w:w="2664"/>
           </w:tcPr>
           <w:p>
             <w:r>
@@ -695,6 +737,20 @@
         <w:rPr>
           <w:b/>
         </w:rPr>
+        <w:t xml:space="preserve">The room reads itself first. </w:t>
+      </w:r>
+      <w:r>
+        <w:t>Quarter 1 closed at Session 6, and its three questions went home on no paper. They are answered aloud at 7:25, before the chain: the leader first, then the room, about the group, never any one person.</w:t>
+      </w:r>
+    </w:p>
+    <w:p>
+      <w:pPr>
+        <w:ind w:left="259"/>
+      </w:pPr>
+      <w:r>
+        <w:rPr>
+          <w:b/>
+        </w:rPr>
         <w:t xml:space="preserve">A pair leads, visibly. </w:t>
       </w:r>
       <w:r>
@@ -730,7 +786,7 @@
     </w:p>
     <w:p>
       <w:r>
-        <w:t>The Session 7 sheet unchanged: daily PROAPT — one short passage per day, five to ten minutes; the journal Week 7 pages carry the daily template; passage paths on the handout (Mark, the Sermon on the Mount, or Romans 8). The chain only works if we work it.</w:t>
+        <w:t>The Session 7 sheet, with its companion page “PROAPT, What Each Step Is For” (the first item points to it): daily PROAPT — one short passage per day, five to ten minutes; the journal Week 7 pages carry the daily template; passage paths on the handout (Mark, the Sermon on the Mount, or Romans 8). The chain only works if we work it.</w:t>
       </w:r>
     </w:p>
     <w:p>

</xml_diff>